<commit_message>
Update resource navigation and intelligence translations
</commit_message>
<xml_diff>
--- a/reports/ml_architecture/eic_reports/d698e35e24f3/es/classio_experiment_report_d698e35e24f3_v6.docx
+++ b/reports/ml_architecture/eic_reports/d698e35e24f3/es/classio_experiment_report_d698e35e24f3_v6.docx
@@ -47,7 +47,7 @@
           <w:color w:val="5A626F"/>
           <w:sz w:val="22"/>
         </w:rPr>
-        <w:t>Can Classio discover semantic relationships between educational resources without manual labels to improve recommendation candidates and similar-resource warnings?</w:t>
+        <w:t>¿Puede Classio descubrir relaciones semánticas entre recursos educativos sin etiquetas manuales para mejorar candidatos de recomendación y avisos de recursos similares?</w:t>
       </w:r>
     </w:p>
     <w:p>
@@ -79,7 +79,7 @@
           <w:color w:val="5A626F"/>
           <w:sz w:val="20"/>
         </w:rPr>
-        <w:t>Generado el 26/07/2026 03:12</w:t>
+        <w:t>Generado el 28/07/2026 23:43</w:t>
       </w:r>
     </w:p>
     <w:p>
@@ -281,7 +281,7 @@
                 <w:color w:val="2D2D2D"/>
                 <w:sz w:val="18"/>
               </w:rPr>
-              <w:t>Classio experimenta fallas en la recomendación de materiales a los docentes, ya que los recursos sugeridos frecuentemente no coinciden con el tema de la clase.</w:t>
+              <w:t>Classio actualmente tiene errores al recomendar materiales a los profesores. Los materiales recomendados no atienden muchas veces al tema de la clase.</w:t>
             </w:r>
           </w:p>
         </w:tc>
@@ -343,7 +343,7 @@
                 <w:color w:val="2D2D2D"/>
                 <w:sz w:val="18"/>
               </w:rPr>
-              <w:t>Se propone mejorar el sistema de recomendaciones mediante la implementación de un modelo de algoritmo no supervisado.</w:t>
+              <w:t>Mejorar el sistema de recomendaciones con un modelo de algoritmo no supervisado</w:t>
             </w:r>
           </w:p>
         </w:tc>
@@ -405,7 +405,7 @@
                 <w:color w:val="2D2D2D"/>
                 <w:sz w:val="18"/>
               </w:rPr>
-              <w:t>Definición de éxito: que el 80 % de la muestra sea clasificada correctamente.</w:t>
+              <w:t>Que el 80% de la muestra esté clasificada de manera correcta.</w:t>
             </w:r>
           </w:p>
         </w:tc>
@@ -467,7 +467,7 @@
                 <w:color w:val="2D2D2D"/>
                 <w:sz w:val="18"/>
               </w:rPr>
-              <w:t>Se espera incrementar la confianza del docente en el sistema de recomendación y mejorar la retención al reducir el tiempo necesario para localizar un recurso.</w:t>
+              <w:t>La confianza en el sistema de recomendación y la retención de docentes al disminuir el tiempo de búsqueda de un recurso.</w:t>
             </w:r>
           </w:p>
         </w:tc>
@@ -503,6 +503,1706 @@
         <w:t>Este experimento usa perfiles canónicos de recursos y algoritmos no supervisados para descubrir clústeres y vecinos semánticos sin construir etiquetas positivas/negativas.</w:t>
       </w:r>
     </w:p>
+    <w:p>
+      <w:pPr>
+        <w:pStyle w:val="Heading2"/>
+        <w:keepNext/>
+        <w:spacing w:before="120" w:after="80"/>
+      </w:pPr>
+      <w:r>
+        <w:rPr>
+          <w:rFonts w:ascii="Arial" w:hAnsi="Arial"/>
+          <w:b/>
+          <w:i w:val="0"/>
+          <w:color w:val="1F3A5F"/>
+          <w:sz w:val="26"/>
+        </w:rPr>
+        <w:t>Datos utilizados y desarrollo en Python</w:t>
+      </w:r>
+    </w:p>
+    <w:tbl>
+      <w:tblPr>
+        <w:tblW w:type="dxa" w:w="9647"/>
+        <w:jc w:val="left"/>
+        <w:tblLayout w:type="fixed"/>
+        <w:tblLook w:firstColumn="1" w:firstRow="1" w:lastColumn="0" w:lastRow="0" w:noHBand="0" w:noVBand="1" w:val="04A0"/>
+      </w:tblPr>
+      <w:tblGrid>
+        <w:gridCol w:w="4968"/>
+        <w:gridCol w:w="4968"/>
+      </w:tblGrid>
+      <w:tr>
+        <w:trPr>
+          <w:trHeight w:hRule="atLeast"/>
+          <w:cantSplit/>
+          <w:tblHeader w:val="true"/>
+        </w:trPr>
+        <w:tc>
+          <w:tcPr>
+            <w:tcW w:type="dxa" w:w="3024"/>
+            <w:tcMar>
+              <w:top w:w="80" w:type="dxa"/>
+              <w:bottom w:w="80" w:type="dxa"/>
+              <w:left w:w="120" w:type="dxa"/>
+              <w:right w:w="120" w:type="dxa"/>
+            </w:tcMar>
+            <w:vAlign w:val="center"/>
+            <w:shd w:fill="EAF0F7"/>
+          </w:tcPr>
+          <w:p>
+            <w:pPr>
+              <w:spacing w:after="40" w:line="252" w:lineRule="auto"/>
+              <w:jc w:val="center"/>
+            </w:pPr>
+            <w:r>
+              <w:rPr>
+                <w:rFonts w:ascii="Arial" w:hAnsi="Arial"/>
+                <w:b/>
+                <w:i w:val="0"/>
+                <w:color w:val="1F3A5F"/>
+                <w:sz w:val="19"/>
+              </w:rPr>
+              <w:t>Campo</w:t>
+            </w:r>
+          </w:p>
+        </w:tc>
+        <w:tc>
+          <w:tcPr>
+            <w:tcW w:type="dxa" w:w="6623"/>
+            <w:tcMar>
+              <w:top w:w="80" w:type="dxa"/>
+              <w:bottom w:w="80" w:type="dxa"/>
+              <w:left w:w="120" w:type="dxa"/>
+              <w:right w:w="120" w:type="dxa"/>
+            </w:tcMar>
+            <w:vAlign w:val="center"/>
+            <w:shd w:fill="EAF0F7"/>
+          </w:tcPr>
+          <w:p>
+            <w:pPr>
+              <w:spacing w:after="40" w:line="252" w:lineRule="auto"/>
+              <w:jc w:val="center"/>
+            </w:pPr>
+            <w:r>
+              <w:rPr>
+                <w:rFonts w:ascii="Arial" w:hAnsi="Arial"/>
+                <w:b/>
+                <w:i w:val="0"/>
+                <w:color w:val="1F3A5F"/>
+                <w:sz w:val="19"/>
+              </w:rPr>
+              <w:t>Valor</w:t>
+            </w:r>
+          </w:p>
+        </w:tc>
+      </w:tr>
+      <w:tr>
+        <w:trPr>
+          <w:trHeight w:hRule="atLeast"/>
+          <w:cantSplit/>
+        </w:trPr>
+        <w:tc>
+          <w:tcPr>
+            <w:tcW w:type="dxa" w:w="3024"/>
+            <w:tcMar>
+              <w:top w:w="80" w:type="dxa"/>
+              <w:bottom w:w="80" w:type="dxa"/>
+              <w:left w:w="120" w:type="dxa"/>
+              <w:right w:w="120" w:type="dxa"/>
+            </w:tcMar>
+            <w:vAlign w:val="center"/>
+          </w:tcPr>
+          <w:p>
+            <w:pPr>
+              <w:spacing w:after="40" w:line="252" w:lineRule="auto"/>
+              <w:jc w:val="left"/>
+            </w:pPr>
+            <w:r>
+              <w:rPr>
+                <w:rFonts w:ascii="Arial" w:hAnsi="Arial"/>
+                <w:b w:val="0"/>
+                <w:i w:val="0"/>
+                <w:color w:val="2D2D2D"/>
+                <w:sz w:val="18"/>
+              </w:rPr>
+              <w:t>Lenguaje</w:t>
+            </w:r>
+          </w:p>
+        </w:tc>
+        <w:tc>
+          <w:tcPr>
+            <w:tcW w:type="dxa" w:w="6623"/>
+            <w:tcMar>
+              <w:top w:w="80" w:type="dxa"/>
+              <w:bottom w:w="80" w:type="dxa"/>
+              <w:left w:w="120" w:type="dxa"/>
+              <w:right w:w="120" w:type="dxa"/>
+            </w:tcMar>
+            <w:vAlign w:val="center"/>
+          </w:tcPr>
+          <w:p>
+            <w:pPr>
+              <w:spacing w:after="40" w:line="252" w:lineRule="auto"/>
+              <w:jc w:val="left"/>
+            </w:pPr>
+            <w:r>
+              <w:rPr>
+                <w:rFonts w:ascii="Arial" w:hAnsi="Arial"/>
+                <w:b w:val="0"/>
+                <w:i w:val="0"/>
+                <w:color w:val="2D2D2D"/>
+                <w:sz w:val="18"/>
+              </w:rPr>
+              <w:t>n/a</w:t>
+            </w:r>
+          </w:p>
+        </w:tc>
+      </w:tr>
+      <w:tr>
+        <w:trPr>
+          <w:trHeight w:hRule="atLeast"/>
+          <w:cantSplit/>
+        </w:trPr>
+        <w:tc>
+          <w:tcPr>
+            <w:tcW w:type="dxa" w:w="3024"/>
+            <w:tcMar>
+              <w:top w:w="80" w:type="dxa"/>
+              <w:bottom w:w="80" w:type="dxa"/>
+              <w:left w:w="120" w:type="dxa"/>
+              <w:right w:w="120" w:type="dxa"/>
+            </w:tcMar>
+            <w:vAlign w:val="center"/>
+          </w:tcPr>
+          <w:p>
+            <w:pPr>
+              <w:spacing w:after="40" w:line="252" w:lineRule="auto"/>
+              <w:jc w:val="left"/>
+            </w:pPr>
+            <w:r>
+              <w:rPr>
+                <w:rFonts w:ascii="Arial" w:hAnsi="Arial"/>
+                <w:b w:val="0"/>
+                <w:i w:val="0"/>
+                <w:color w:val="2D2D2D"/>
+                <w:sz w:val="18"/>
+              </w:rPr>
+              <w:t>Librerías principales</w:t>
+            </w:r>
+          </w:p>
+        </w:tc>
+        <w:tc>
+          <w:tcPr>
+            <w:tcW w:type="dxa" w:w="6623"/>
+            <w:tcMar>
+              <w:top w:w="80" w:type="dxa"/>
+              <w:bottom w:w="80" w:type="dxa"/>
+              <w:left w:w="120" w:type="dxa"/>
+              <w:right w:w="120" w:type="dxa"/>
+            </w:tcMar>
+            <w:vAlign w:val="center"/>
+          </w:tcPr>
+          <w:p>
+            <w:pPr>
+              <w:spacing w:after="40" w:line="252" w:lineRule="auto"/>
+              <w:jc w:val="left"/>
+            </w:pPr>
+            <w:r>
+              <w:rPr>
+                <w:rFonts w:ascii="Arial" w:hAnsi="Arial"/>
+                <w:b w:val="0"/>
+                <w:i w:val="0"/>
+                <w:color w:val="2D2D2D"/>
+                <w:sz w:val="18"/>
+              </w:rPr>
+            </w:r>
+          </w:p>
+        </w:tc>
+      </w:tr>
+      <w:tr>
+        <w:trPr>
+          <w:trHeight w:hRule="atLeast"/>
+          <w:cantSplit/>
+        </w:trPr>
+        <w:tc>
+          <w:tcPr>
+            <w:tcW w:type="dxa" w:w="3024"/>
+            <w:tcMar>
+              <w:top w:w="80" w:type="dxa"/>
+              <w:bottom w:w="80" w:type="dxa"/>
+              <w:left w:w="120" w:type="dxa"/>
+              <w:right w:w="120" w:type="dxa"/>
+            </w:tcMar>
+            <w:vAlign w:val="center"/>
+          </w:tcPr>
+          <w:p>
+            <w:pPr>
+              <w:spacing w:after="40" w:line="252" w:lineRule="auto"/>
+              <w:jc w:val="left"/>
+            </w:pPr>
+            <w:r>
+              <w:rPr>
+                <w:rFonts w:ascii="Arial" w:hAnsi="Arial"/>
+                <w:b w:val="0"/>
+                <w:i w:val="0"/>
+                <w:color w:val="2D2D2D"/>
+                <w:sz w:val="18"/>
+              </w:rPr>
+              <w:t>Datos utilizados</w:t>
+            </w:r>
+          </w:p>
+        </w:tc>
+        <w:tc>
+          <w:tcPr>
+            <w:tcW w:type="dxa" w:w="6623"/>
+            <w:tcMar>
+              <w:top w:w="80" w:type="dxa"/>
+              <w:bottom w:w="80" w:type="dxa"/>
+              <w:left w:w="120" w:type="dxa"/>
+              <w:right w:w="120" w:type="dxa"/>
+            </w:tcMar>
+            <w:vAlign w:val="center"/>
+          </w:tcPr>
+          <w:p>
+            <w:pPr>
+              <w:spacing w:after="40" w:line="252" w:lineRule="auto"/>
+              <w:jc w:val="left"/>
+            </w:pPr>
+            <w:r>
+              <w:rPr>
+                <w:rFonts w:ascii="Arial" w:hAnsi="Arial"/>
+                <w:b w:val="0"/>
+                <w:i w:val="0"/>
+                <w:color w:val="2D2D2D"/>
+                <w:sz w:val="18"/>
+              </w:rPr>
+            </w:r>
+          </w:p>
+        </w:tc>
+      </w:tr>
+      <w:tr>
+        <w:trPr>
+          <w:trHeight w:hRule="atLeast"/>
+          <w:cantSplit/>
+        </w:trPr>
+        <w:tc>
+          <w:tcPr>
+            <w:tcW w:type="dxa" w:w="3024"/>
+            <w:tcMar>
+              <w:top w:w="80" w:type="dxa"/>
+              <w:bottom w:w="80" w:type="dxa"/>
+              <w:left w:w="120" w:type="dxa"/>
+              <w:right w:w="120" w:type="dxa"/>
+            </w:tcMar>
+            <w:vAlign w:val="center"/>
+          </w:tcPr>
+          <w:p>
+            <w:pPr>
+              <w:spacing w:after="40" w:line="252" w:lineRule="auto"/>
+              <w:jc w:val="left"/>
+            </w:pPr>
+            <w:r>
+              <w:rPr>
+                <w:rFonts w:ascii="Arial" w:hAnsi="Arial"/>
+                <w:b w:val="0"/>
+                <w:i w:val="0"/>
+                <w:color w:val="2D2D2D"/>
+                <w:sz w:val="18"/>
+              </w:rPr>
+              <w:t>Reglas de inclusión/exclusión</w:t>
+            </w:r>
+          </w:p>
+        </w:tc>
+        <w:tc>
+          <w:tcPr>
+            <w:tcW w:type="dxa" w:w="6623"/>
+            <w:tcMar>
+              <w:top w:w="80" w:type="dxa"/>
+              <w:bottom w:w="80" w:type="dxa"/>
+              <w:left w:w="120" w:type="dxa"/>
+              <w:right w:w="120" w:type="dxa"/>
+            </w:tcMar>
+            <w:vAlign w:val="center"/>
+          </w:tcPr>
+          <w:p>
+            <w:pPr>
+              <w:spacing w:after="40" w:line="252" w:lineRule="auto"/>
+              <w:jc w:val="left"/>
+            </w:pPr>
+            <w:r>
+              <w:rPr>
+                <w:rFonts w:ascii="Arial" w:hAnsi="Arial"/>
+                <w:b w:val="0"/>
+                <w:i w:val="0"/>
+                <w:color w:val="2D2D2D"/>
+                <w:sz w:val="18"/>
+              </w:rPr>
+            </w:r>
+          </w:p>
+        </w:tc>
+      </w:tr>
+      <w:tr>
+        <w:trPr>
+          <w:trHeight w:hRule="atLeast"/>
+          <w:cantSplit/>
+        </w:trPr>
+        <w:tc>
+          <w:tcPr>
+            <w:tcW w:type="dxa" w:w="3024"/>
+            <w:tcMar>
+              <w:top w:w="80" w:type="dxa"/>
+              <w:bottom w:w="80" w:type="dxa"/>
+              <w:left w:w="120" w:type="dxa"/>
+              <w:right w:w="120" w:type="dxa"/>
+            </w:tcMar>
+            <w:vAlign w:val="center"/>
+          </w:tcPr>
+          <w:p>
+            <w:pPr>
+              <w:spacing w:after="40" w:line="252" w:lineRule="auto"/>
+              <w:jc w:val="left"/>
+            </w:pPr>
+            <w:r>
+              <w:rPr>
+                <w:rFonts w:ascii="Arial" w:hAnsi="Arial"/>
+                <w:b w:val="0"/>
+                <w:i w:val="0"/>
+                <w:color w:val="2D2D2D"/>
+                <w:sz w:val="18"/>
+              </w:rPr>
+              <w:t>Construcción de perfiles</w:t>
+            </w:r>
+          </w:p>
+        </w:tc>
+        <w:tc>
+          <w:tcPr>
+            <w:tcW w:type="dxa" w:w="6623"/>
+            <w:tcMar>
+              <w:top w:w="80" w:type="dxa"/>
+              <w:bottom w:w="80" w:type="dxa"/>
+              <w:left w:w="120" w:type="dxa"/>
+              <w:right w:w="120" w:type="dxa"/>
+            </w:tcMar>
+            <w:vAlign w:val="center"/>
+          </w:tcPr>
+          <w:p>
+            <w:pPr>
+              <w:spacing w:after="40" w:line="252" w:lineRule="auto"/>
+              <w:jc w:val="left"/>
+            </w:pPr>
+            <w:r>
+              <w:rPr>
+                <w:rFonts w:ascii="Arial" w:hAnsi="Arial"/>
+                <w:b w:val="0"/>
+                <w:i w:val="0"/>
+                <w:color w:val="2D2D2D"/>
+                <w:sz w:val="18"/>
+              </w:rPr>
+            </w:r>
+          </w:p>
+        </w:tc>
+      </w:tr>
+      <w:tr>
+        <w:trPr>
+          <w:trHeight w:hRule="atLeast"/>
+          <w:cantSplit/>
+        </w:trPr>
+        <w:tc>
+          <w:tcPr>
+            <w:tcW w:type="dxa" w:w="3024"/>
+            <w:tcMar>
+              <w:top w:w="80" w:type="dxa"/>
+              <w:bottom w:w="80" w:type="dxa"/>
+              <w:left w:w="120" w:type="dxa"/>
+              <w:right w:w="120" w:type="dxa"/>
+            </w:tcMar>
+            <w:vAlign w:val="center"/>
+          </w:tcPr>
+          <w:p>
+            <w:pPr>
+              <w:spacing w:after="40" w:line="252" w:lineRule="auto"/>
+              <w:jc w:val="left"/>
+            </w:pPr>
+            <w:r>
+              <w:rPr>
+                <w:rFonts w:ascii="Arial" w:hAnsi="Arial"/>
+                <w:b w:val="0"/>
+                <w:i w:val="0"/>
+                <w:color w:val="2D2D2D"/>
+                <w:sz w:val="18"/>
+              </w:rPr>
+              <w:t>Pipeline del modelo</w:t>
+            </w:r>
+          </w:p>
+        </w:tc>
+        <w:tc>
+          <w:tcPr>
+            <w:tcW w:type="dxa" w:w="6623"/>
+            <w:tcMar>
+              <w:top w:w="80" w:type="dxa"/>
+              <w:bottom w:w="80" w:type="dxa"/>
+              <w:left w:w="120" w:type="dxa"/>
+              <w:right w:w="120" w:type="dxa"/>
+            </w:tcMar>
+            <w:vAlign w:val="center"/>
+          </w:tcPr>
+          <w:p>
+            <w:pPr>
+              <w:spacing w:after="40" w:line="252" w:lineRule="auto"/>
+              <w:jc w:val="left"/>
+            </w:pPr>
+            <w:r>
+              <w:rPr>
+                <w:rFonts w:ascii="Arial" w:hAnsi="Arial"/>
+                <w:b w:val="0"/>
+                <w:i w:val="0"/>
+                <w:color w:val="2D2D2D"/>
+                <w:sz w:val="18"/>
+              </w:rPr>
+            </w:r>
+          </w:p>
+        </w:tc>
+      </w:tr>
+      <w:tr>
+        <w:trPr>
+          <w:trHeight w:hRule="atLeast"/>
+          <w:cantSplit/>
+        </w:trPr>
+        <w:tc>
+          <w:tcPr>
+            <w:tcW w:type="dxa" w:w="3024"/>
+            <w:tcMar>
+              <w:top w:w="80" w:type="dxa"/>
+              <w:bottom w:w="80" w:type="dxa"/>
+              <w:left w:w="120" w:type="dxa"/>
+              <w:right w:w="120" w:type="dxa"/>
+            </w:tcMar>
+            <w:vAlign w:val="center"/>
+          </w:tcPr>
+          <w:p>
+            <w:pPr>
+              <w:spacing w:after="40" w:line="252" w:lineRule="auto"/>
+              <w:jc w:val="left"/>
+            </w:pPr>
+            <w:r>
+              <w:rPr>
+                <w:rFonts w:ascii="Arial" w:hAnsi="Arial"/>
+                <w:b w:val="0"/>
+                <w:i w:val="0"/>
+                <w:color w:val="2D2D2D"/>
+                <w:sz w:val="18"/>
+              </w:rPr>
+              <w:t>Reproducibilidad</w:t>
+            </w:r>
+          </w:p>
+        </w:tc>
+        <w:tc>
+          <w:tcPr>
+            <w:tcW w:type="dxa" w:w="6623"/>
+            <w:tcMar>
+              <w:top w:w="80" w:type="dxa"/>
+              <w:bottom w:w="80" w:type="dxa"/>
+              <w:left w:w="120" w:type="dxa"/>
+              <w:right w:w="120" w:type="dxa"/>
+            </w:tcMar>
+            <w:vAlign w:val="center"/>
+          </w:tcPr>
+          <w:p>
+            <w:pPr>
+              <w:spacing w:after="40" w:line="252" w:lineRule="auto"/>
+              <w:jc w:val="left"/>
+            </w:pPr>
+            <w:r>
+              <w:rPr>
+                <w:rFonts w:ascii="Arial" w:hAnsi="Arial"/>
+                <w:b w:val="0"/>
+                <w:i w:val="0"/>
+                <w:color w:val="2D2D2D"/>
+                <w:sz w:val="18"/>
+              </w:rPr>
+            </w:r>
+          </w:p>
+        </w:tc>
+      </w:tr>
+    </w:tbl>
+    <w:p/>
+    <w:p>
+      <w:pPr>
+        <w:pStyle w:val="Heading2"/>
+        <w:keepNext/>
+        <w:spacing w:before="120" w:after="80"/>
+      </w:pPr>
+      <w:r>
+        <w:rPr>
+          <w:rFonts w:ascii="Arial" w:hAnsi="Arial"/>
+          <w:b/>
+          <w:i w:val="0"/>
+          <w:color w:val="1F3A5F"/>
+          <w:sz w:val="26"/>
+        </w:rPr>
+        <w:t>Normalización y preparación de datos</w:t>
+      </w:r>
+    </w:p>
+    <w:tbl>
+      <w:tblPr>
+        <w:tblW w:type="dxa" w:w="9647"/>
+        <w:jc w:val="left"/>
+        <w:tblLayout w:type="fixed"/>
+        <w:tblLook w:firstColumn="1" w:firstRow="1" w:lastColumn="0" w:lastRow="0" w:noHBand="0" w:noVBand="1" w:val="04A0"/>
+      </w:tblPr>
+      <w:tblGrid>
+        <w:gridCol w:w="4968"/>
+        <w:gridCol w:w="4968"/>
+      </w:tblGrid>
+      <w:tr>
+        <w:trPr>
+          <w:trHeight w:hRule="atLeast"/>
+          <w:cantSplit/>
+          <w:tblHeader w:val="true"/>
+        </w:trPr>
+        <w:tc>
+          <w:tcPr>
+            <w:tcW w:type="dxa" w:w="3024"/>
+            <w:tcMar>
+              <w:top w:w="80" w:type="dxa"/>
+              <w:bottom w:w="80" w:type="dxa"/>
+              <w:left w:w="120" w:type="dxa"/>
+              <w:right w:w="120" w:type="dxa"/>
+            </w:tcMar>
+            <w:vAlign w:val="center"/>
+            <w:shd w:fill="EAF0F7"/>
+          </w:tcPr>
+          <w:p>
+            <w:pPr>
+              <w:spacing w:after="40" w:line="252" w:lineRule="auto"/>
+              <w:jc w:val="center"/>
+            </w:pPr>
+            <w:r>
+              <w:rPr>
+                <w:rFonts w:ascii="Arial" w:hAnsi="Arial"/>
+                <w:b/>
+                <w:i w:val="0"/>
+                <w:color w:val="1F3A5F"/>
+                <w:sz w:val="19"/>
+              </w:rPr>
+              <w:t>Campo</w:t>
+            </w:r>
+          </w:p>
+        </w:tc>
+        <w:tc>
+          <w:tcPr>
+            <w:tcW w:type="dxa" w:w="6623"/>
+            <w:tcMar>
+              <w:top w:w="80" w:type="dxa"/>
+              <w:bottom w:w="80" w:type="dxa"/>
+              <w:left w:w="120" w:type="dxa"/>
+              <w:right w:w="120" w:type="dxa"/>
+            </w:tcMar>
+            <w:vAlign w:val="center"/>
+            <w:shd w:fill="EAF0F7"/>
+          </w:tcPr>
+          <w:p>
+            <w:pPr>
+              <w:spacing w:after="40" w:line="252" w:lineRule="auto"/>
+              <w:jc w:val="center"/>
+            </w:pPr>
+            <w:r>
+              <w:rPr>
+                <w:rFonts w:ascii="Arial" w:hAnsi="Arial"/>
+                <w:b/>
+                <w:i w:val="0"/>
+                <w:color w:val="1F3A5F"/>
+                <w:sz w:val="19"/>
+              </w:rPr>
+              <w:t>Valor</w:t>
+            </w:r>
+          </w:p>
+        </w:tc>
+      </w:tr>
+      <w:tr>
+        <w:trPr>
+          <w:trHeight w:hRule="atLeast"/>
+          <w:cantSplit/>
+        </w:trPr>
+        <w:tc>
+          <w:tcPr>
+            <w:tcW w:type="dxa" w:w="3024"/>
+            <w:tcMar>
+              <w:top w:w="80" w:type="dxa"/>
+              <w:bottom w:w="80" w:type="dxa"/>
+              <w:left w:w="120" w:type="dxa"/>
+              <w:right w:w="120" w:type="dxa"/>
+            </w:tcMar>
+            <w:vAlign w:val="center"/>
+          </w:tcPr>
+          <w:p>
+            <w:pPr>
+              <w:spacing w:after="40" w:line="252" w:lineRule="auto"/>
+              <w:jc w:val="left"/>
+            </w:pPr>
+            <w:r>
+              <w:rPr>
+                <w:rFonts w:ascii="Arial" w:hAnsi="Arial"/>
+                <w:b w:val="0"/>
+                <w:i w:val="0"/>
+                <w:color w:val="2D2D2D"/>
+                <w:sz w:val="18"/>
+              </w:rPr>
+              <w:t>Unidad de análisis</w:t>
+            </w:r>
+          </w:p>
+        </w:tc>
+        <w:tc>
+          <w:tcPr>
+            <w:tcW w:type="dxa" w:w="6623"/>
+            <w:tcMar>
+              <w:top w:w="80" w:type="dxa"/>
+              <w:bottom w:w="80" w:type="dxa"/>
+              <w:left w:w="120" w:type="dxa"/>
+              <w:right w:w="120" w:type="dxa"/>
+            </w:tcMar>
+            <w:vAlign w:val="center"/>
+          </w:tcPr>
+          <w:p>
+            <w:pPr>
+              <w:spacing w:after="40" w:line="252" w:lineRule="auto"/>
+              <w:jc w:val="left"/>
+            </w:pPr>
+            <w:r>
+              <w:rPr>
+                <w:rFonts w:ascii="Arial" w:hAnsi="Arial"/>
+                <w:b w:val="0"/>
+                <w:i w:val="0"/>
+                <w:color w:val="2D2D2D"/>
+                <w:sz w:val="18"/>
+              </w:rPr>
+            </w:r>
+          </w:p>
+        </w:tc>
+      </w:tr>
+      <w:tr>
+        <w:trPr>
+          <w:trHeight w:hRule="atLeast"/>
+          <w:cantSplit/>
+        </w:trPr>
+        <w:tc>
+          <w:tcPr>
+            <w:tcW w:type="dxa" w:w="3024"/>
+            <w:tcMar>
+              <w:top w:w="80" w:type="dxa"/>
+              <w:bottom w:w="80" w:type="dxa"/>
+              <w:left w:w="120" w:type="dxa"/>
+              <w:right w:w="120" w:type="dxa"/>
+            </w:tcMar>
+            <w:vAlign w:val="center"/>
+          </w:tcPr>
+          <w:p>
+            <w:pPr>
+              <w:spacing w:after="40" w:line="252" w:lineRule="auto"/>
+              <w:jc w:val="left"/>
+            </w:pPr>
+            <w:r>
+              <w:rPr>
+                <w:rFonts w:ascii="Arial" w:hAnsi="Arial"/>
+                <w:b w:val="0"/>
+                <w:i w:val="0"/>
+                <w:color w:val="2D2D2D"/>
+                <w:sz w:val="18"/>
+              </w:rPr>
+              <w:t>Roles</w:t>
+            </w:r>
+          </w:p>
+        </w:tc>
+        <w:tc>
+          <w:tcPr>
+            <w:tcW w:type="dxa" w:w="6623"/>
+            <w:tcMar>
+              <w:top w:w="80" w:type="dxa"/>
+              <w:bottom w:w="80" w:type="dxa"/>
+              <w:left w:w="120" w:type="dxa"/>
+              <w:right w:w="120" w:type="dxa"/>
+            </w:tcMar>
+            <w:vAlign w:val="center"/>
+          </w:tcPr>
+          <w:p>
+            <w:pPr>
+              <w:spacing w:after="40" w:line="252" w:lineRule="auto"/>
+              <w:jc w:val="left"/>
+            </w:pPr>
+            <w:r>
+              <w:rPr>
+                <w:rFonts w:ascii="Arial" w:hAnsi="Arial"/>
+                <w:b w:val="0"/>
+                <w:i w:val="0"/>
+                <w:color w:val="2D2D2D"/>
+                <w:sz w:val="18"/>
+              </w:rPr>
+              <w:t>program_topic = ancla curricular; worksheet, exam, video, lesson_plan y program = recursos candidatos.</w:t>
+            </w:r>
+          </w:p>
+        </w:tc>
+      </w:tr>
+      <w:tr>
+        <w:trPr>
+          <w:trHeight w:hRule="atLeast"/>
+          <w:cantSplit/>
+        </w:trPr>
+        <w:tc>
+          <w:tcPr>
+            <w:tcW w:type="dxa" w:w="3024"/>
+            <w:tcMar>
+              <w:top w:w="80" w:type="dxa"/>
+              <w:bottom w:w="80" w:type="dxa"/>
+              <w:left w:w="120" w:type="dxa"/>
+              <w:right w:w="120" w:type="dxa"/>
+            </w:tcMar>
+            <w:vAlign w:val="center"/>
+          </w:tcPr>
+          <w:p>
+            <w:pPr>
+              <w:spacing w:after="40" w:line="252" w:lineRule="auto"/>
+              <w:jc w:val="left"/>
+            </w:pPr>
+            <w:r>
+              <w:rPr>
+                <w:rFonts w:ascii="Arial" w:hAnsi="Arial"/>
+                <w:b w:val="0"/>
+                <w:i w:val="0"/>
+                <w:color w:val="2D2D2D"/>
+                <w:sz w:val="18"/>
+              </w:rPr>
+              <w:t>Limpieza textual</w:t>
+            </w:r>
+          </w:p>
+        </w:tc>
+        <w:tc>
+          <w:tcPr>
+            <w:tcW w:type="dxa" w:w="6623"/>
+            <w:tcMar>
+              <w:top w:w="80" w:type="dxa"/>
+              <w:bottom w:w="80" w:type="dxa"/>
+              <w:left w:w="120" w:type="dxa"/>
+              <w:right w:w="120" w:type="dxa"/>
+            </w:tcMar>
+            <w:vAlign w:val="center"/>
+          </w:tcPr>
+          <w:p>
+            <w:pPr>
+              <w:spacing w:after="40" w:line="252" w:lineRule="auto"/>
+              <w:jc w:val="left"/>
+            </w:pPr>
+            <w:r>
+              <w:rPr>
+                <w:rFonts w:ascii="Arial" w:hAnsi="Arial"/>
+                <w:b w:val="0"/>
+                <w:i w:val="0"/>
+                <w:color w:val="2D2D2D"/>
+                <w:sz w:val="18"/>
+              </w:rPr>
+              <w:t>Los campos se convierten a texto, se compactan espacios múltiples y se eliminan espacios al inicio/final.</w:t>
+            </w:r>
+          </w:p>
+        </w:tc>
+      </w:tr>
+      <w:tr>
+        <w:trPr>
+          <w:trHeight w:hRule="atLeast"/>
+          <w:cantSplit/>
+        </w:trPr>
+        <w:tc>
+          <w:tcPr>
+            <w:tcW w:type="dxa" w:w="3024"/>
+            <w:tcMar>
+              <w:top w:w="80" w:type="dxa"/>
+              <w:bottom w:w="80" w:type="dxa"/>
+              <w:left w:w="120" w:type="dxa"/>
+              <w:right w:w="120" w:type="dxa"/>
+            </w:tcMar>
+            <w:vAlign w:val="center"/>
+          </w:tcPr>
+          <w:p>
+            <w:pPr>
+              <w:spacing w:after="40" w:line="252" w:lineRule="auto"/>
+              <w:jc w:val="left"/>
+            </w:pPr>
+            <w:r>
+              <w:rPr>
+                <w:rFonts w:ascii="Arial" w:hAnsi="Arial"/>
+                <w:b w:val="0"/>
+                <w:i w:val="0"/>
+                <w:color w:val="2D2D2D"/>
+                <w:sz w:val="18"/>
+              </w:rPr>
+              <w:t>Normalización categórica</w:t>
+            </w:r>
+          </w:p>
+        </w:tc>
+        <w:tc>
+          <w:tcPr>
+            <w:tcW w:type="dxa" w:w="6623"/>
+            <w:tcMar>
+              <w:top w:w="80" w:type="dxa"/>
+              <w:bottom w:w="80" w:type="dxa"/>
+              <w:left w:w="120" w:type="dxa"/>
+              <w:right w:w="120" w:type="dxa"/>
+            </w:tcMar>
+            <w:vAlign w:val="center"/>
+          </w:tcPr>
+          <w:p>
+            <w:pPr>
+              <w:spacing w:after="40" w:line="252" w:lineRule="auto"/>
+              <w:jc w:val="left"/>
+            </w:pPr>
+            <w:r>
+              <w:rPr>
+                <w:rFonts w:ascii="Arial" w:hAnsi="Arial"/>
+                <w:b w:val="0"/>
+                <w:i w:val="0"/>
+                <w:color w:val="2D2D2D"/>
+                <w:sz w:val="18"/>
+              </w:rPr>
+              <w:t>Se aplica Unicode NFKC, casefold, normalización de separadores / y |, y alias conocidos para materia e idioma.</w:t>
+            </w:r>
+          </w:p>
+        </w:tc>
+      </w:tr>
+      <w:tr>
+        <w:trPr>
+          <w:trHeight w:hRule="atLeast"/>
+          <w:cantSplit/>
+        </w:trPr>
+        <w:tc>
+          <w:tcPr>
+            <w:tcW w:type="dxa" w:w="3024"/>
+            <w:tcMar>
+              <w:top w:w="80" w:type="dxa"/>
+              <w:bottom w:w="80" w:type="dxa"/>
+              <w:left w:w="120" w:type="dxa"/>
+              <w:right w:w="120" w:type="dxa"/>
+            </w:tcMar>
+            <w:vAlign w:val="center"/>
+          </w:tcPr>
+          <w:p>
+            <w:pPr>
+              <w:spacing w:after="40" w:line="252" w:lineRule="auto"/>
+              <w:jc w:val="left"/>
+            </w:pPr>
+            <w:r>
+              <w:rPr>
+                <w:rFonts w:ascii="Arial" w:hAnsi="Arial"/>
+                <w:b w:val="0"/>
+                <w:i w:val="0"/>
+                <w:color w:val="2D2D2D"/>
+                <w:sz w:val="18"/>
+              </w:rPr>
+              <w:t>Alias usados</w:t>
+            </w:r>
+          </w:p>
+        </w:tc>
+        <w:tc>
+          <w:tcPr>
+            <w:tcW w:type="dxa" w:w="6623"/>
+            <w:tcMar>
+              <w:top w:w="80" w:type="dxa"/>
+              <w:bottom w:w="80" w:type="dxa"/>
+              <w:left w:w="120" w:type="dxa"/>
+              <w:right w:w="120" w:type="dxa"/>
+            </w:tcMar>
+            <w:vAlign w:val="center"/>
+          </w:tcPr>
+          <w:p>
+            <w:pPr>
+              <w:spacing w:after="40" w:line="252" w:lineRule="auto"/>
+              <w:jc w:val="left"/>
+            </w:pPr>
+            <w:r>
+              <w:rPr>
+                <w:rFonts w:ascii="Arial" w:hAnsi="Arial"/>
+                <w:b w:val="0"/>
+                <w:i w:val="0"/>
+                <w:color w:val="2D2D2D"/>
+                <w:sz w:val="18"/>
+              </w:rPr>
+              <w:t>{}</w:t>
+            </w:r>
+          </w:p>
+        </w:tc>
+      </w:tr>
+      <w:tr>
+        <w:trPr>
+          <w:trHeight w:hRule="atLeast"/>
+          <w:cantSplit/>
+        </w:trPr>
+        <w:tc>
+          <w:tcPr>
+            <w:tcW w:type="dxa" w:w="3024"/>
+            <w:tcMar>
+              <w:top w:w="80" w:type="dxa"/>
+              <w:bottom w:w="80" w:type="dxa"/>
+              <w:left w:w="120" w:type="dxa"/>
+              <w:right w:w="120" w:type="dxa"/>
+            </w:tcMar>
+            <w:vAlign w:val="center"/>
+          </w:tcPr>
+          <w:p>
+            <w:pPr>
+              <w:spacing w:after="40" w:line="252" w:lineRule="auto"/>
+              <w:jc w:val="left"/>
+            </w:pPr>
+            <w:r>
+              <w:rPr>
+                <w:rFonts w:ascii="Arial" w:hAnsi="Arial"/>
+                <w:b w:val="0"/>
+                <w:i w:val="0"/>
+                <w:color w:val="2D2D2D"/>
+                <w:sz w:val="18"/>
+              </w:rPr>
+              <w:t>Valores faltantes</w:t>
+            </w:r>
+          </w:p>
+        </w:tc>
+        <w:tc>
+          <w:tcPr>
+            <w:tcW w:type="dxa" w:w="6623"/>
+            <w:tcMar>
+              <w:top w:w="80" w:type="dxa"/>
+              <w:bottom w:w="80" w:type="dxa"/>
+              <w:left w:w="120" w:type="dxa"/>
+              <w:right w:w="120" w:type="dxa"/>
+            </w:tcMar>
+            <w:vAlign w:val="center"/>
+          </w:tcPr>
+          <w:p>
+            <w:pPr>
+              <w:spacing w:after="40" w:line="252" w:lineRule="auto"/>
+              <w:jc w:val="left"/>
+            </w:pPr>
+            <w:r>
+              <w:rPr>
+                <w:rFonts w:ascii="Arial" w:hAnsi="Arial"/>
+                <w:b w:val="0"/>
+                <w:i w:val="0"/>
+                <w:color w:val="2D2D2D"/>
+                <w:sz w:val="18"/>
+              </w:rPr>
+              <w:t>Los valores vacíos se auditan y no cuentan en denominadores de contaminación entre materias o idiomas.</w:t>
+            </w:r>
+          </w:p>
+        </w:tc>
+      </w:tr>
+      <w:tr>
+        <w:trPr>
+          <w:trHeight w:hRule="atLeast"/>
+          <w:cantSplit/>
+        </w:trPr>
+        <w:tc>
+          <w:tcPr>
+            <w:tcW w:type="dxa" w:w="3024"/>
+            <w:tcMar>
+              <w:top w:w="80" w:type="dxa"/>
+              <w:bottom w:w="80" w:type="dxa"/>
+              <w:left w:w="120" w:type="dxa"/>
+              <w:right w:w="120" w:type="dxa"/>
+            </w:tcMar>
+            <w:vAlign w:val="center"/>
+          </w:tcPr>
+          <w:p>
+            <w:pPr>
+              <w:spacing w:after="40" w:line="252" w:lineRule="auto"/>
+              <w:jc w:val="left"/>
+            </w:pPr>
+            <w:r>
+              <w:rPr>
+                <w:rFonts w:ascii="Arial" w:hAnsi="Arial"/>
+                <w:b w:val="0"/>
+                <w:i w:val="0"/>
+                <w:color w:val="2D2D2D"/>
+                <w:sz w:val="18"/>
+              </w:rPr>
+              <w:t>Completitud</w:t>
+            </w:r>
+          </w:p>
+        </w:tc>
+        <w:tc>
+          <w:tcPr>
+            <w:tcW w:type="dxa" w:w="6623"/>
+            <w:tcMar>
+              <w:top w:w="80" w:type="dxa"/>
+              <w:bottom w:w="80" w:type="dxa"/>
+              <w:left w:w="120" w:type="dxa"/>
+              <w:right w:w="120" w:type="dxa"/>
+            </w:tcMar>
+            <w:vAlign w:val="center"/>
+          </w:tcPr>
+          <w:p>
+            <w:pPr>
+              <w:spacing w:after="40" w:line="252" w:lineRule="auto"/>
+              <w:jc w:val="left"/>
+            </w:pPr>
+            <w:r>
+              <w:rPr>
+                <w:rFonts w:ascii="Arial" w:hAnsi="Arial"/>
+                <w:b w:val="0"/>
+                <w:i w:val="0"/>
+                <w:color w:val="2D2D2D"/>
+                <w:sz w:val="18"/>
+              </w:rPr>
+              <w:t>{}</w:t>
+            </w:r>
+          </w:p>
+        </w:tc>
+      </w:tr>
+      <w:tr>
+        <w:trPr>
+          <w:trHeight w:hRule="atLeast"/>
+          <w:cantSplit/>
+        </w:trPr>
+        <w:tc>
+          <w:tcPr>
+            <w:tcW w:type="dxa" w:w="3024"/>
+            <w:tcMar>
+              <w:top w:w="80" w:type="dxa"/>
+              <w:bottom w:w="80" w:type="dxa"/>
+              <w:left w:w="120" w:type="dxa"/>
+              <w:right w:w="120" w:type="dxa"/>
+            </w:tcMar>
+            <w:vAlign w:val="center"/>
+          </w:tcPr>
+          <w:p>
+            <w:pPr>
+              <w:spacing w:after="40" w:line="252" w:lineRule="auto"/>
+              <w:jc w:val="left"/>
+            </w:pPr>
+            <w:r>
+              <w:rPr>
+                <w:rFonts w:ascii="Arial" w:hAnsi="Arial"/>
+                <w:b w:val="0"/>
+                <w:i w:val="0"/>
+                <w:color w:val="2D2D2D"/>
+                <w:sz w:val="18"/>
+              </w:rPr>
+              <w:t>Vectorización</w:t>
+            </w:r>
+          </w:p>
+        </w:tc>
+        <w:tc>
+          <w:tcPr>
+            <w:tcW w:type="dxa" w:w="6623"/>
+            <w:tcMar>
+              <w:top w:w="80" w:type="dxa"/>
+              <w:bottom w:w="80" w:type="dxa"/>
+              <w:left w:w="120" w:type="dxa"/>
+              <w:right w:w="120" w:type="dxa"/>
+            </w:tcMar>
+            <w:vAlign w:val="center"/>
+          </w:tcPr>
+          <w:p>
+            <w:pPr>
+              <w:spacing w:after="40" w:line="252" w:lineRule="auto"/>
+              <w:jc w:val="left"/>
+            </w:pPr>
+            <w:r>
+              <w:rPr>
+                <w:rFonts w:ascii="Arial" w:hAnsi="Arial"/>
+                <w:b w:val="0"/>
+                <w:i w:val="0"/>
+                <w:color w:val="2D2D2D"/>
+                <w:sz w:val="18"/>
+              </w:rPr>
+              <w:t>TF-IDF con unigramas y bigramas; SVD truncado cuando el tamaño lo permite; normalización L2 antes de similaridad coseno.</w:t>
+            </w:r>
+          </w:p>
+        </w:tc>
+      </w:tr>
+      <w:tr>
+        <w:trPr>
+          <w:trHeight w:hRule="atLeast"/>
+          <w:cantSplit/>
+        </w:trPr>
+        <w:tc>
+          <w:tcPr>
+            <w:tcW w:type="dxa" w:w="3024"/>
+            <w:tcMar>
+              <w:top w:w="80" w:type="dxa"/>
+              <w:bottom w:w="80" w:type="dxa"/>
+              <w:left w:w="120" w:type="dxa"/>
+              <w:right w:w="120" w:type="dxa"/>
+            </w:tcMar>
+            <w:vAlign w:val="center"/>
+          </w:tcPr>
+          <w:p>
+            <w:pPr>
+              <w:spacing w:after="40" w:line="252" w:lineRule="auto"/>
+              <w:jc w:val="left"/>
+            </w:pPr>
+            <w:r>
+              <w:rPr>
+                <w:rFonts w:ascii="Arial" w:hAnsi="Arial"/>
+                <w:b w:val="0"/>
+                <w:i w:val="0"/>
+                <w:color w:val="2D2D2D"/>
+                <w:sz w:val="18"/>
+              </w:rPr>
+              <w:t>Artefactos auditables</w:t>
+            </w:r>
+          </w:p>
+        </w:tc>
+        <w:tc>
+          <w:tcPr>
+            <w:tcW w:type="dxa" w:w="6623"/>
+            <w:tcMar>
+              <w:top w:w="80" w:type="dxa"/>
+              <w:bottom w:w="80" w:type="dxa"/>
+              <w:left w:w="120" w:type="dxa"/>
+              <w:right w:w="120" w:type="dxa"/>
+            </w:tcMar>
+            <w:vAlign w:val="center"/>
+          </w:tcPr>
+          <w:p>
+            <w:pPr>
+              <w:spacing w:after="40" w:line="252" w:lineRule="auto"/>
+              <w:jc w:val="left"/>
+            </w:pPr>
+            <w:r>
+              <w:rPr>
+                <w:rFonts w:ascii="Arial" w:hAnsi="Arial"/>
+                <w:b w:val="0"/>
+                <w:i w:val="0"/>
+                <w:color w:val="2D2D2D"/>
+                <w:sz w:val="18"/>
+              </w:rPr>
+            </w:r>
+          </w:p>
+        </w:tc>
+      </w:tr>
+    </w:tbl>
+    <w:p/>
+    <w:p>
+      <w:pPr>
+        <w:pStyle w:val="Heading2"/>
+        <w:keepNext/>
+        <w:spacing w:before="120" w:after="80"/>
+      </w:pPr>
+      <w:r>
+        <w:rPr>
+          <w:rFonts w:ascii="Arial" w:hAnsi="Arial"/>
+          <w:b/>
+          <w:i w:val="0"/>
+          <w:color w:val="1F3A5F"/>
+          <w:sz w:val="26"/>
+        </w:rPr>
+        <w:t>Fórmula de scoring del ganador</w:t>
+      </w:r>
+    </w:p>
+    <w:tbl>
+      <w:tblPr>
+        <w:tblW w:type="dxa" w:w="9647"/>
+        <w:jc w:val="left"/>
+        <w:tblLayout w:type="fixed"/>
+        <w:tblLook w:firstColumn="1" w:firstRow="1" w:lastColumn="0" w:lastRow="0" w:noHBand="0" w:noVBand="1" w:val="04A0"/>
+      </w:tblPr>
+      <w:tblGrid>
+        <w:gridCol w:w="4968"/>
+        <w:gridCol w:w="4968"/>
+      </w:tblGrid>
+      <w:tr>
+        <w:trPr>
+          <w:trHeight w:hRule="atLeast"/>
+          <w:cantSplit/>
+          <w:tblHeader w:val="true"/>
+        </w:trPr>
+        <w:tc>
+          <w:tcPr>
+            <w:tcW w:type="dxa" w:w="3024"/>
+            <w:tcMar>
+              <w:top w:w="80" w:type="dxa"/>
+              <w:bottom w:w="80" w:type="dxa"/>
+              <w:left w:w="120" w:type="dxa"/>
+              <w:right w:w="120" w:type="dxa"/>
+            </w:tcMar>
+            <w:vAlign w:val="center"/>
+            <w:shd w:fill="EAF0F7"/>
+          </w:tcPr>
+          <w:p>
+            <w:pPr>
+              <w:spacing w:after="40" w:line="252" w:lineRule="auto"/>
+              <w:jc w:val="center"/>
+            </w:pPr>
+            <w:r>
+              <w:rPr>
+                <w:rFonts w:ascii="Arial" w:hAnsi="Arial"/>
+                <w:b/>
+                <w:i w:val="0"/>
+                <w:color w:val="1F3A5F"/>
+                <w:sz w:val="19"/>
+              </w:rPr>
+              <w:t>Campo</w:t>
+            </w:r>
+          </w:p>
+        </w:tc>
+        <w:tc>
+          <w:tcPr>
+            <w:tcW w:type="dxa" w:w="6623"/>
+            <w:tcMar>
+              <w:top w:w="80" w:type="dxa"/>
+              <w:bottom w:w="80" w:type="dxa"/>
+              <w:left w:w="120" w:type="dxa"/>
+              <w:right w:w="120" w:type="dxa"/>
+            </w:tcMar>
+            <w:vAlign w:val="center"/>
+            <w:shd w:fill="EAF0F7"/>
+          </w:tcPr>
+          <w:p>
+            <w:pPr>
+              <w:spacing w:after="40" w:line="252" w:lineRule="auto"/>
+              <w:jc w:val="center"/>
+            </w:pPr>
+            <w:r>
+              <w:rPr>
+                <w:rFonts w:ascii="Arial" w:hAnsi="Arial"/>
+                <w:b/>
+                <w:i w:val="0"/>
+                <w:color w:val="1F3A5F"/>
+                <w:sz w:val="19"/>
+              </w:rPr>
+              <w:t>Valor</w:t>
+            </w:r>
+          </w:p>
+        </w:tc>
+      </w:tr>
+      <w:tr>
+        <w:trPr>
+          <w:trHeight w:hRule="atLeast"/>
+          <w:cantSplit/>
+        </w:trPr>
+        <w:tc>
+          <w:tcPr>
+            <w:tcW w:type="dxa" w:w="3024"/>
+            <w:tcMar>
+              <w:top w:w="80" w:type="dxa"/>
+              <w:bottom w:w="80" w:type="dxa"/>
+              <w:left w:w="120" w:type="dxa"/>
+              <w:right w:w="120" w:type="dxa"/>
+            </w:tcMar>
+            <w:vAlign w:val="center"/>
+          </w:tcPr>
+          <w:p>
+            <w:pPr>
+              <w:spacing w:after="40" w:line="252" w:lineRule="auto"/>
+              <w:jc w:val="left"/>
+            </w:pPr>
+            <w:r>
+              <w:rPr>
+                <w:rFonts w:ascii="Arial" w:hAnsi="Arial"/>
+                <w:b w:val="0"/>
+                <w:i w:val="0"/>
+                <w:color w:val="2D2D2D"/>
+                <w:sz w:val="18"/>
+              </w:rPr>
+              <w:t>Fórmula</w:t>
+            </w:r>
+          </w:p>
+        </w:tc>
+        <w:tc>
+          <w:tcPr>
+            <w:tcW w:type="dxa" w:w="6623"/>
+            <w:tcMar>
+              <w:top w:w="80" w:type="dxa"/>
+              <w:bottom w:w="80" w:type="dxa"/>
+              <w:left w:w="120" w:type="dxa"/>
+              <w:right w:w="120" w:type="dxa"/>
+            </w:tcMar>
+            <w:vAlign w:val="center"/>
+          </w:tcPr>
+          <w:p>
+            <w:pPr>
+              <w:spacing w:after="40" w:line="252" w:lineRule="auto"/>
+              <w:jc w:val="left"/>
+            </w:pPr>
+            <w:r>
+              <w:rPr>
+                <w:rFonts w:ascii="Arial" w:hAnsi="Arial"/>
+                <w:b w:val="0"/>
+                <w:i w:val="0"/>
+                <w:color w:val="2D2D2D"/>
+                <w:sz w:val="18"/>
+              </w:rPr>
+              <w:t>n/a</w:t>
+            </w:r>
+          </w:p>
+        </w:tc>
+      </w:tr>
+      <w:tr>
+        <w:trPr>
+          <w:trHeight w:hRule="atLeast"/>
+          <w:cantSplit/>
+        </w:trPr>
+        <w:tc>
+          <w:tcPr>
+            <w:tcW w:type="dxa" w:w="3024"/>
+            <w:tcMar>
+              <w:top w:w="80" w:type="dxa"/>
+              <w:bottom w:w="80" w:type="dxa"/>
+              <w:left w:w="120" w:type="dxa"/>
+              <w:right w:w="120" w:type="dxa"/>
+            </w:tcMar>
+            <w:vAlign w:val="center"/>
+          </w:tcPr>
+          <w:p>
+            <w:pPr>
+              <w:spacing w:after="40" w:line="252" w:lineRule="auto"/>
+              <w:jc w:val="left"/>
+            </w:pPr>
+            <w:r>
+              <w:rPr>
+                <w:rFonts w:ascii="Arial" w:hAnsi="Arial"/>
+                <w:b w:val="0"/>
+                <w:i w:val="0"/>
+                <w:color w:val="2D2D2D"/>
+                <w:sz w:val="18"/>
+              </w:rPr>
+              <w:t>Orden de selección</w:t>
+            </w:r>
+          </w:p>
+        </w:tc>
+        <w:tc>
+          <w:tcPr>
+            <w:tcW w:type="dxa" w:w="6623"/>
+            <w:tcMar>
+              <w:top w:w="80" w:type="dxa"/>
+              <w:bottom w:w="80" w:type="dxa"/>
+              <w:left w:w="120" w:type="dxa"/>
+              <w:right w:w="120" w:type="dxa"/>
+            </w:tcMar>
+            <w:vAlign w:val="center"/>
+          </w:tcPr>
+          <w:p>
+            <w:pPr>
+              <w:spacing w:after="40" w:line="252" w:lineRule="auto"/>
+              <w:jc w:val="left"/>
+            </w:pPr>
+            <w:r>
+              <w:rPr>
+                <w:rFonts w:ascii="Arial" w:hAnsi="Arial"/>
+                <w:b w:val="0"/>
+                <w:i w:val="0"/>
+                <w:color w:val="2D2D2D"/>
+                <w:sz w:val="18"/>
+              </w:rPr>
+            </w:r>
+          </w:p>
+        </w:tc>
+      </w:tr>
+      <w:tr>
+        <w:trPr>
+          <w:trHeight w:hRule="atLeast"/>
+          <w:cantSplit/>
+        </w:trPr>
+        <w:tc>
+          <w:tcPr>
+            <w:tcW w:type="dxa" w:w="3024"/>
+            <w:tcMar>
+              <w:top w:w="80" w:type="dxa"/>
+              <w:bottom w:w="80" w:type="dxa"/>
+              <w:left w:w="120" w:type="dxa"/>
+              <w:right w:w="120" w:type="dxa"/>
+            </w:tcMar>
+            <w:vAlign w:val="center"/>
+          </w:tcPr>
+          <w:p>
+            <w:pPr>
+              <w:spacing w:after="40" w:line="252" w:lineRule="auto"/>
+              <w:jc w:val="left"/>
+            </w:pPr>
+            <w:r>
+              <w:rPr>
+                <w:rFonts w:ascii="Arial" w:hAnsi="Arial"/>
+                <w:b w:val="0"/>
+                <w:i w:val="0"/>
+                <w:color w:val="2D2D2D"/>
+                <w:sz w:val="18"/>
+              </w:rPr>
+              <w:t>Ganador</w:t>
+            </w:r>
+          </w:p>
+        </w:tc>
+        <w:tc>
+          <w:tcPr>
+            <w:tcW w:type="dxa" w:w="6623"/>
+            <w:tcMar>
+              <w:top w:w="80" w:type="dxa"/>
+              <w:bottom w:w="80" w:type="dxa"/>
+              <w:left w:w="120" w:type="dxa"/>
+              <w:right w:w="120" w:type="dxa"/>
+            </w:tcMar>
+            <w:vAlign w:val="center"/>
+          </w:tcPr>
+          <w:p>
+            <w:pPr>
+              <w:spacing w:after="40" w:line="252" w:lineRule="auto"/>
+              <w:jc w:val="left"/>
+            </w:pPr>
+            <w:r>
+              <w:rPr>
+                <w:rFonts w:ascii="Arial" w:hAnsi="Arial"/>
+                <w:b w:val="0"/>
+                <w:i w:val="0"/>
+                <w:color w:val="2D2D2D"/>
+                <w:sz w:val="18"/>
+              </w:rPr>
+              <w:t>n/a; selection_score=n/a</w:t>
+            </w:r>
+          </w:p>
+        </w:tc>
+      </w:tr>
+      <w:tr>
+        <w:trPr>
+          <w:trHeight w:hRule="atLeast"/>
+          <w:cantSplit/>
+        </w:trPr>
+        <w:tc>
+          <w:tcPr>
+            <w:tcW w:type="dxa" w:w="3024"/>
+            <w:tcMar>
+              <w:top w:w="80" w:type="dxa"/>
+              <w:bottom w:w="80" w:type="dxa"/>
+              <w:left w:w="120" w:type="dxa"/>
+              <w:right w:w="120" w:type="dxa"/>
+            </w:tcMar>
+            <w:vAlign w:val="center"/>
+          </w:tcPr>
+          <w:p>
+            <w:pPr>
+              <w:spacing w:after="40" w:line="252" w:lineRule="auto"/>
+              <w:jc w:val="left"/>
+            </w:pPr>
+            <w:r>
+              <w:rPr>
+                <w:rFonts w:ascii="Arial" w:hAnsi="Arial"/>
+                <w:b w:val="0"/>
+                <w:i w:val="0"/>
+                <w:color w:val="2D2D2D"/>
+                <w:sz w:val="18"/>
+              </w:rPr>
+              <w:t>Líder por Silhouette</w:t>
+            </w:r>
+          </w:p>
+        </w:tc>
+        <w:tc>
+          <w:tcPr>
+            <w:tcW w:type="dxa" w:w="6623"/>
+            <w:tcMar>
+              <w:top w:w="80" w:type="dxa"/>
+              <w:bottom w:w="80" w:type="dxa"/>
+              <w:left w:w="120" w:type="dxa"/>
+              <w:right w:w="120" w:type="dxa"/>
+            </w:tcMar>
+            <w:vAlign w:val="center"/>
+          </w:tcPr>
+          <w:p>
+            <w:pPr>
+              <w:spacing w:after="40" w:line="252" w:lineRule="auto"/>
+              <w:jc w:val="left"/>
+            </w:pPr>
+            <w:r>
+              <w:rPr>
+                <w:rFonts w:ascii="Arial" w:hAnsi="Arial"/>
+                <w:b w:val="0"/>
+                <w:i w:val="0"/>
+                <w:color w:val="2D2D2D"/>
+                <w:sz w:val="18"/>
+              </w:rPr>
+              <w:t>n/a; selection_score=n/a</w:t>
+            </w:r>
+          </w:p>
+        </w:tc>
+      </w:tr>
+      <w:tr>
+        <w:trPr>
+          <w:trHeight w:hRule="atLeast"/>
+          <w:cantSplit/>
+        </w:trPr>
+        <w:tc>
+          <w:tcPr>
+            <w:tcW w:type="dxa" w:w="3024"/>
+            <w:tcMar>
+              <w:top w:w="80" w:type="dxa"/>
+              <w:bottom w:w="80" w:type="dxa"/>
+              <w:left w:w="120" w:type="dxa"/>
+              <w:right w:w="120" w:type="dxa"/>
+            </w:tcMar>
+            <w:vAlign w:val="center"/>
+          </w:tcPr>
+          <w:p>
+            <w:pPr>
+              <w:spacing w:after="40" w:line="252" w:lineRule="auto"/>
+              <w:jc w:val="left"/>
+            </w:pPr>
+            <w:r>
+              <w:rPr>
+                <w:rFonts w:ascii="Arial" w:hAnsi="Arial"/>
+                <w:b w:val="0"/>
+                <w:i w:val="0"/>
+                <w:color w:val="2D2D2D"/>
+                <w:sz w:val="18"/>
+              </w:rPr>
+              <w:t>Definición de componentes</w:t>
+            </w:r>
+          </w:p>
+        </w:tc>
+        <w:tc>
+          <w:tcPr>
+            <w:tcW w:type="dxa" w:w="6623"/>
+            <w:tcMar>
+              <w:top w:w="80" w:type="dxa"/>
+              <w:bottom w:w="80" w:type="dxa"/>
+              <w:left w:w="120" w:type="dxa"/>
+              <w:right w:w="120" w:type="dxa"/>
+            </w:tcMar>
+            <w:vAlign w:val="center"/>
+          </w:tcPr>
+          <w:p>
+            <w:pPr>
+              <w:spacing w:after="40" w:line="252" w:lineRule="auto"/>
+              <w:jc w:val="left"/>
+            </w:pPr>
+            <w:r>
+              <w:rPr>
+                <w:rFonts w:ascii="Arial" w:hAnsi="Arial"/>
+                <w:b w:val="0"/>
+                <w:i w:val="0"/>
+                <w:color w:val="2D2D2D"/>
+                <w:sz w:val="18"/>
+              </w:rPr>
+              <w:t>{}</w:t>
+            </w:r>
+          </w:p>
+        </w:tc>
+      </w:tr>
+      <w:tr>
+        <w:trPr>
+          <w:trHeight w:hRule="atLeast"/>
+          <w:cantSplit/>
+        </w:trPr>
+        <w:tc>
+          <w:tcPr>
+            <w:tcW w:type="dxa" w:w="3024"/>
+            <w:tcMar>
+              <w:top w:w="80" w:type="dxa"/>
+              <w:bottom w:w="80" w:type="dxa"/>
+              <w:left w:w="120" w:type="dxa"/>
+              <w:right w:w="120" w:type="dxa"/>
+            </w:tcMar>
+            <w:vAlign w:val="center"/>
+          </w:tcPr>
+          <w:p>
+            <w:pPr>
+              <w:spacing w:after="40" w:line="252" w:lineRule="auto"/>
+              <w:jc w:val="left"/>
+            </w:pPr>
+            <w:r>
+              <w:rPr>
+                <w:rFonts w:ascii="Arial" w:hAnsi="Arial"/>
+                <w:b w:val="0"/>
+                <w:i w:val="0"/>
+                <w:color w:val="2D2D2D"/>
+                <w:sz w:val="18"/>
+              </w:rPr>
+              <w:t>Justificación de pesos</w:t>
+            </w:r>
+          </w:p>
+        </w:tc>
+        <w:tc>
+          <w:tcPr>
+            <w:tcW w:type="dxa" w:w="6623"/>
+            <w:tcMar>
+              <w:top w:w="80" w:type="dxa"/>
+              <w:bottom w:w="80" w:type="dxa"/>
+              <w:left w:w="120" w:type="dxa"/>
+              <w:right w:w="120" w:type="dxa"/>
+            </w:tcMar>
+            <w:vAlign w:val="center"/>
+          </w:tcPr>
+          <w:p>
+            <w:pPr>
+              <w:spacing w:after="40" w:line="252" w:lineRule="auto"/>
+              <w:jc w:val="left"/>
+            </w:pPr>
+            <w:r>
+              <w:rPr>
+                <w:rFonts w:ascii="Arial" w:hAnsi="Arial"/>
+                <w:b w:val="0"/>
+                <w:i w:val="0"/>
+                <w:color w:val="2D2D2D"/>
+                <w:sz w:val="18"/>
+              </w:rPr>
+            </w:r>
+          </w:p>
+        </w:tc>
+      </w:tr>
+      <w:tr>
+        <w:trPr>
+          <w:trHeight w:hRule="atLeast"/>
+          <w:cantSplit/>
+        </w:trPr>
+        <w:tc>
+          <w:tcPr>
+            <w:tcW w:type="dxa" w:w="3024"/>
+            <w:tcMar>
+              <w:top w:w="80" w:type="dxa"/>
+              <w:bottom w:w="80" w:type="dxa"/>
+              <w:left w:w="120" w:type="dxa"/>
+              <w:right w:w="120" w:type="dxa"/>
+            </w:tcMar>
+            <w:vAlign w:val="center"/>
+          </w:tcPr>
+          <w:p>
+            <w:pPr>
+              <w:spacing w:after="40" w:line="252" w:lineRule="auto"/>
+              <w:jc w:val="left"/>
+            </w:pPr>
+            <w:r>
+              <w:rPr>
+                <w:rFonts w:ascii="Arial" w:hAnsi="Arial"/>
+                <w:b w:val="0"/>
+                <w:i w:val="0"/>
+                <w:color w:val="2D2D2D"/>
+                <w:sz w:val="18"/>
+              </w:rPr>
+              <w:t>Por qué no Silhouette solamente</w:t>
+            </w:r>
+          </w:p>
+        </w:tc>
+        <w:tc>
+          <w:tcPr>
+            <w:tcW w:type="dxa" w:w="6623"/>
+            <w:tcMar>
+              <w:top w:w="80" w:type="dxa"/>
+              <w:bottom w:w="80" w:type="dxa"/>
+              <w:left w:w="120" w:type="dxa"/>
+              <w:right w:w="120" w:type="dxa"/>
+            </w:tcMar>
+            <w:vAlign w:val="center"/>
+          </w:tcPr>
+          <w:p>
+            <w:pPr>
+              <w:spacing w:after="40" w:line="252" w:lineRule="auto"/>
+              <w:jc w:val="left"/>
+            </w:pPr>
+            <w:r>
+              <w:rPr>
+                <w:rFonts w:ascii="Arial" w:hAnsi="Arial"/>
+                <w:b w:val="0"/>
+                <w:i w:val="0"/>
+                <w:color w:val="2D2D2D"/>
+                <w:sz w:val="18"/>
+              </w:rPr>
+            </w:r>
+          </w:p>
+        </w:tc>
+      </w:tr>
+    </w:tbl>
+    <w:p/>
     <w:p>
       <w:r>
         <w:drawing>
@@ -1268,6 +2968,68 @@
                 <w:color w:val="2D2D2D"/>
                 <w:sz w:val="18"/>
               </w:rPr>
+              <w:t>Selection score</w:t>
+            </w:r>
+          </w:p>
+        </w:tc>
+        <w:tc>
+          <w:tcPr>
+            <w:tcW w:type="dxa" w:w="6192"/>
+            <w:tcMar>
+              <w:top w:w="80" w:type="dxa"/>
+              <w:bottom w:w="80" w:type="dxa"/>
+              <w:left w:w="120" w:type="dxa"/>
+              <w:right w:w="120" w:type="dxa"/>
+            </w:tcMar>
+            <w:vAlign w:val="center"/>
+          </w:tcPr>
+          <w:p>
+            <w:pPr>
+              <w:spacing w:after="40" w:line="252" w:lineRule="auto"/>
+              <w:jc w:val="left"/>
+            </w:pPr>
+            <w:r>
+              <w:rPr>
+                <w:rFonts w:ascii="Arial" w:hAnsi="Arial"/>
+                <w:b w:val="0"/>
+                <w:i w:val="0"/>
+                <w:color w:val="2D2D2D"/>
+                <w:sz w:val="18"/>
+              </w:rPr>
+              <w:t>n/a</w:t>
+            </w:r>
+          </w:p>
+        </w:tc>
+      </w:tr>
+      <w:tr>
+        <w:trPr>
+          <w:trHeight w:hRule="atLeast"/>
+          <w:cantSplit/>
+        </w:trPr>
+        <w:tc>
+          <w:tcPr>
+            <w:tcW w:type="dxa" w:w="3456"/>
+            <w:tcMar>
+              <w:top w:w="80" w:type="dxa"/>
+              <w:bottom w:w="80" w:type="dxa"/>
+              <w:left w:w="120" w:type="dxa"/>
+              <w:right w:w="120" w:type="dxa"/>
+            </w:tcMar>
+            <w:vAlign w:val="center"/>
+          </w:tcPr>
+          <w:p>
+            <w:pPr>
+              <w:spacing w:after="40" w:line="252" w:lineRule="auto"/>
+              <w:jc w:val="left"/>
+            </w:pPr>
+            <w:r>
+              <w:rPr>
+                <w:rFonts w:ascii="Arial" w:hAnsi="Arial"/>
+                <w:b w:val="0"/>
+                <w:i w:val="0"/>
+                <w:color w:val="2D2D2D"/>
+                <w:sz w:val="18"/>
+              </w:rPr>
               <w:t>Recursos incluidos</w:t>
             </w:r>
           </w:p>
@@ -1297,6 +3059,130 @@
                 <w:sz w:val="18"/>
               </w:rPr>
               <w:t>180</w:t>
+            </w:r>
+          </w:p>
+        </w:tc>
+      </w:tr>
+      <w:tr>
+        <w:trPr>
+          <w:trHeight w:hRule="atLeast"/>
+          <w:cantSplit/>
+        </w:trPr>
+        <w:tc>
+          <w:tcPr>
+            <w:tcW w:type="dxa" w:w="3456"/>
+            <w:tcMar>
+              <w:top w:w="80" w:type="dxa"/>
+              <w:bottom w:w="80" w:type="dxa"/>
+              <w:left w:w="120" w:type="dxa"/>
+              <w:right w:w="120" w:type="dxa"/>
+            </w:tcMar>
+            <w:vAlign w:val="center"/>
+          </w:tcPr>
+          <w:p>
+            <w:pPr>
+              <w:spacing w:after="40" w:line="252" w:lineRule="auto"/>
+              <w:jc w:val="left"/>
+            </w:pPr>
+            <w:r>
+              <w:rPr>
+                <w:rFonts w:ascii="Arial" w:hAnsi="Arial"/>
+                <w:b w:val="0"/>
+                <w:i w:val="0"/>
+                <w:color w:val="2D2D2D"/>
+                <w:sz w:val="18"/>
+              </w:rPr>
+              <w:t>Anclas curriculares</w:t>
+            </w:r>
+          </w:p>
+        </w:tc>
+        <w:tc>
+          <w:tcPr>
+            <w:tcW w:type="dxa" w:w="6192"/>
+            <w:tcMar>
+              <w:top w:w="80" w:type="dxa"/>
+              <w:bottom w:w="80" w:type="dxa"/>
+              <w:left w:w="120" w:type="dxa"/>
+              <w:right w:w="120" w:type="dxa"/>
+            </w:tcMar>
+            <w:vAlign w:val="center"/>
+          </w:tcPr>
+          <w:p>
+            <w:pPr>
+              <w:spacing w:after="40" w:line="252" w:lineRule="auto"/>
+              <w:jc w:val="left"/>
+            </w:pPr>
+            <w:r>
+              <w:rPr>
+                <w:rFonts w:ascii="Arial" w:hAnsi="Arial"/>
+                <w:b w:val="0"/>
+                <w:i w:val="0"/>
+                <w:color w:val="2D2D2D"/>
+                <w:sz w:val="18"/>
+              </w:rPr>
+              <w:t>n/a</w:t>
+            </w:r>
+          </w:p>
+        </w:tc>
+      </w:tr>
+      <w:tr>
+        <w:trPr>
+          <w:trHeight w:hRule="atLeast"/>
+          <w:cantSplit/>
+        </w:trPr>
+        <w:tc>
+          <w:tcPr>
+            <w:tcW w:type="dxa" w:w="3456"/>
+            <w:tcMar>
+              <w:top w:w="80" w:type="dxa"/>
+              <w:bottom w:w="80" w:type="dxa"/>
+              <w:left w:w="120" w:type="dxa"/>
+              <w:right w:w="120" w:type="dxa"/>
+            </w:tcMar>
+            <w:vAlign w:val="center"/>
+          </w:tcPr>
+          <w:p>
+            <w:pPr>
+              <w:spacing w:after="40" w:line="252" w:lineRule="auto"/>
+              <w:jc w:val="left"/>
+            </w:pPr>
+            <w:r>
+              <w:rPr>
+                <w:rFonts w:ascii="Arial" w:hAnsi="Arial"/>
+                <w:b w:val="0"/>
+                <w:i w:val="0"/>
+                <w:color w:val="2D2D2D"/>
+                <w:sz w:val="18"/>
+              </w:rPr>
+              <w:t>Recursos candidatos</w:t>
+            </w:r>
+          </w:p>
+        </w:tc>
+        <w:tc>
+          <w:tcPr>
+            <w:tcW w:type="dxa" w:w="6192"/>
+            <w:tcMar>
+              <w:top w:w="80" w:type="dxa"/>
+              <w:bottom w:w="80" w:type="dxa"/>
+              <w:left w:w="120" w:type="dxa"/>
+              <w:right w:w="120" w:type="dxa"/>
+            </w:tcMar>
+            <w:vAlign w:val="center"/>
+          </w:tcPr>
+          <w:p>
+            <w:pPr>
+              <w:spacing w:after="40" w:line="252" w:lineRule="auto"/>
+              <w:jc w:val="left"/>
+            </w:pPr>
+            <w:r>
+              <w:rPr>
+                <w:rFonts w:ascii="Arial" w:hAnsi="Arial"/>
+                <w:b w:val="0"/>
+                <w:i w:val="0"/>
+                <w:color w:val="2D2D2D"/>
+                <w:sz w:val="18"/>
+              </w:rPr>
+              <w:t>n/a</w:t>
             </w:r>
           </w:p>
         </w:tc>
@@ -1674,7 +3560,7 @@
                 <w:color w:val="323232"/>
                 <w:sz w:val="20"/>
               </w:rPr>
-              <w:t>Los resultados confirman que el enfoque no supervisado es viable para descubrir afinidades entre recursos, pero la ausencia de etiquetas de referencia limita la evaluación de la precisión. Para validar la mejora de recomendaciones y la reducción del tiempo de búsqueda, se requiere incorporar revisión humana y pruebas en modo sombra.</w:t>
+              <w:t>El resultado es exploratorio y apto para análisis de shadow testing; no debe activar cambios automáticos en producción sin revisión humana de vecinos/clústeres.</w:t>
             </w:r>
           </w:p>
         </w:tc>
@@ -1711,7 +3597,7 @@
           <w:color w:val="282828"/>
           <w:sz w:val="20"/>
         </w:rPr>
-        <w:t>No se utilizan etiquetas humanas de relevancia semántica en la fase exploratoria.</w:t>
+        <w:t>En esta fase no supervisada no se usan etiquetas humanas de relevancia semántica.</w:t>
       </w:r>
     </w:p>
     <w:p>
@@ -1727,7 +3613,7 @@
           <w:color w:val="282828"/>
           <w:sz w:val="20"/>
         </w:rPr>
-        <w:t>Los catálogos de recursos pequeños o desbalanceados pueden generar inestabilidad en las métricas de clustering.</w:t>
+        <w:t>Los catálogos de recursos pequeños o desbalanceados pueden volver inestables las métricas de agrupamiento.</w:t>
       </w:r>
     </w:p>
     <w:p>
@@ -1743,55 +3629,7 @@
           <w:color w:val="282828"/>
           <w:sz w:val="20"/>
         </w:rPr>
-        <w:t>Las reglas de negocio deben filtrar recursos por materia, idioma, docente, estudiante, nivel y estado de archivo.</w:t>
-      </w:r>
-    </w:p>
-    <w:p>
-      <w:pPr>
-        <w:pStyle w:val="ListBullet"/>
-        <w:spacing w:after="80"/>
-      </w:pPr>
-      <w:r>
-        <w:rPr>
-          <w:rFonts w:ascii="Arial" w:hAnsi="Arial"/>
-          <w:b w:val="0"/>
-          <w:i w:val="0"/>
-          <w:color w:val="282828"/>
-          <w:sz w:val="20"/>
-        </w:rPr>
-        <w:t>No human-labeled semantic relevance labels are used in this unsupervised phase.</w:t>
-      </w:r>
-    </w:p>
-    <w:p>
-      <w:pPr>
-        <w:pStyle w:val="ListBullet"/>
-        <w:spacing w:after="80"/>
-      </w:pPr>
-      <w:r>
-        <w:rPr>
-          <w:rFonts w:ascii="Arial" w:hAnsi="Arial"/>
-          <w:b w:val="0"/>
-          <w:i w:val="0"/>
-          <w:color w:val="282828"/>
-          <w:sz w:val="20"/>
-        </w:rPr>
-        <w:t>Small or imbalanced resource catalogs can make clustering metrics unstable.</w:t>
-      </w:r>
-    </w:p>
-    <w:p>
-      <w:pPr>
-        <w:pStyle w:val="ListBullet"/>
-        <w:spacing w:after="80"/>
-      </w:pPr>
-      <w:r>
-        <w:rPr>
-          <w:rFonts w:ascii="Arial" w:hAnsi="Arial"/>
-          <w:b w:val="0"/>
-          <w:i w:val="0"/>
-          <w:color w:val="282828"/>
-          <w:sz w:val="20"/>
-        </w:rPr>
-        <w:t>Business rules must still filter by subject, language, teacher, student, level, and archive state.</w:t>
+        <w:t>Las reglas de negocio todavía deben filtrar por materia, idioma, profesor, estudiante, nivel y estado de archivo.</w:t>
       </w:r>
     </w:p>
     <w:p>
@@ -2753,7 +4591,7 @@
                 <w:color w:val="2D2D2D"/>
                 <w:sz w:val="18"/>
               </w:rPr>
-              <w:t>Holdout Predictions CSV</w:t>
+              <w:t>Pairwise Semantic Neighbors CSV</w:t>
             </w:r>
           </w:p>
         </w:tc>
@@ -3045,7 +4883,7 @@
                 <w:color w:val="2D2D2D"/>
                 <w:sz w:val="18"/>
               </w:rPr>
-              <w:t>Label Audit CSV</w:t>
+              <w:t>Profile Audit CSV</w:t>
             </w:r>
           </w:p>
         </w:tc>
@@ -3191,7 +5029,7 @@
                 <w:color w:val="2D2D2D"/>
                 <w:sz w:val="18"/>
               </w:rPr>
-              <w:t>Label Reconciliation CSV</w:t>
+              <w:t>Unsupervised Validation Reconciliation CSV</w:t>
             </w:r>
           </w:p>
         </w:tc>

</xml_diff>